<commit_message>
ChatGPT guides: corrections from OpenAI Help Center check
Verified the toolkit and glossary against help.openai.com (2026-10-30):
- Model: Sol/Terra/Luna are Work and Codex models; Chat uses GPT-6 with
  Instant/Medium/High/Extra High (+ Pro) effort levels.
- Temporary chat can use memories when Personalized; it never creates or
  updates them.
- Sites are built from Work; apps and plugins live under Plugins in the
  sidebar; custom GPTs migrate to plugins.

Co-Authored-By: Claude Opus 5.5 <noreply@anthropic.com>
</commit_message>
<xml_diff>
--- a/assets/guides/Blach_ChatGPT_AI_Glossary.docx
+++ b/assets/guides/Blach_ChatGPT_AI_Glossary.docx
@@ -158,7 +158,7 @@
           <w:sz w:val="20"/>
           <w:szCs w:val="20"/>
         </w:rPr>
-        <w:t xml:space="preserve">— The engine behind each answer. Blach’s ChatGPT models come in three tiers: Sol (most capable), Terra (balanced, for everyday work) and Luna (fastest). You pick one from the model menu.</w:t>
+        <w:t xml:space="preserve">— The engine behind each answer. In Chat, you pick GPT-6 from the model menu. Work and Codex have their own model picker with the Sol (most capable), Terra (balanced) and Luna (fastest) families, depending on what’s enabled for you.</w:t>
       </w:r>
     </w:p>
     <w:p>
@@ -184,7 +184,7 @@
           <w:sz w:val="20"/>
           <w:szCs w:val="20"/>
         </w:rPr>
-        <w:t xml:space="preserve">— How long the model thinks before it answers, from Instant up to Extra High. More effort gives more careful answers but uses more of your limit.</w:t>
+        <w:t xml:space="preserve">— How long the model thinks before it answers. In Chat you choose Instant, Medium, High, or Extra High (plus Pro for the hardest questions). More effort gives more careful answers but uses more of your limit.</w:t>
       </w:r>
     </w:p>
     <w:p>
@@ -605,7 +605,7 @@
           <w:sz w:val="20"/>
           <w:szCs w:val="20"/>
         </w:rPr>
-        <w:t xml:space="preserve">— A web page or lightweight app — a tracker, dashboard, or portal — that ChatGPT builds and hosts at a link. New sites are private until you share them.</w:t>
+        <w:t xml:space="preserve">— A web page or lightweight app — a tracker, dashboard, or portal — that ChatGPT builds in Work and hosts at a link. New sites are private until you share them.</w:t>
       </w:r>
     </w:p>
     <w:p>
@@ -792,7 +792,7 @@
           <w:sz w:val="20"/>
           <w:szCs w:val="20"/>
         </w:rPr>
-        <w:t xml:space="preserve">— A secure link between ChatGPT and an outside system (such as SharePoint or Outlook) that lets ChatGPT look things up and work within it. OpenAI now calls connectors “apps.”</w:t>
+        <w:t xml:space="preserve">— A secure link between ChatGPT and an outside system (such as SharePoint or Outlook) that lets ChatGPT look things up and work within it. OpenAI now calls connectors “apps”; find them under Plugins in the sidebar.</w:t>
       </w:r>
     </w:p>
     <w:p>
@@ -818,7 +818,7 @@
           <w:sz w:val="20"/>
           <w:szCs w:val="20"/>
         </w:rPr>
-        <w:t xml:space="preserve">— A package that bundles skills and apps for a workflow, installed from the plugin directory.</w:t>
+        <w:t xml:space="preserve">— A package that bundles skills and apps for a task, installed from Plugins in the sidebar.</w:t>
       </w:r>
     </w:p>
     <w:p>
@@ -870,7 +870,7 @@
           <w:sz w:val="20"/>
           <w:szCs w:val="20"/>
         </w:rPr>
-        <w:t xml:space="preserve">— A customized ChatGPT with its own instructions and files. OpenAI is retiring custom GPTs on December 11, 2026 — use Projects and Skills instead.</w:t>
+        <w:t xml:space="preserve">— A customized ChatGPT with its own instructions and files. OpenAI is retiring custom GPTs on December 11, 2026 and moving them to plugins — use Projects and Skills for new work.</w:t>
       </w:r>
     </w:p>
     <w:p>
@@ -1083,7 +1083,7 @@
           <w:sz w:val="20"/>
           <w:szCs w:val="20"/>
         </w:rPr>
-        <w:t xml:space="preserve">— Each person has their own allowance. If you hit a limit, wait until it resets — other models may still work. With credits turned off, hitting a limit won’t trigger extra charges.</w:t>
+        <w:t xml:space="preserve">— Each person has their own allowance. If you hit a limit, wait until it resets — other features may still work. With credits turned off, hitting a limit won’t trigger extra charges.</w:t>
       </w:r>
     </w:p>
     <w:p>
@@ -1109,7 +1109,7 @@
           <w:sz w:val="20"/>
           <w:szCs w:val="20"/>
         </w:rPr>
-        <w:t xml:space="preserve">— A chat that stays out of your history and doesn’t use or update memory. OpenAI may still keep it for up to 30 days for safety.</w:t>
+        <w:t xml:space="preserve">— A chat that stays out of your history and never creates or updates memories. Choose Personalized or Unpersonalized before your first message. OpenAI may keep a copy for up to 30 days for safety.</w:t>
       </w:r>
     </w:p>
     <w:p>

</xml_diff>